<commit_message>
feat: initialize project structure with production plans, SVG assets, and documentation scaffolding.
</commit_message>
<xml_diff>
--- a/01_Client_Facing/AAA_Events_Project_Agreement.docx
+++ b/01_Client_Facing/AAA_Events_Project_Agreement.docx
@@ -382,7 +382,7 @@
                 <w:color w:val="1A1A2E"/>
                 <w:sz w:val="18"/>
               </w:rPr>
-              <w:t>Visitors fill a form; all 3 owners get an instant WhatsApp message with lead details</w:t>
+              <w:t>Visitors fill a form; both directors get an instant WhatsApp message with lead details</w:t>
             </w:r>
           </w:p>
         </w:tc>
@@ -1057,7 +1057,7 @@
           <w:color w:val="555566"/>
           <w:sz w:val="20"/>
         </w:rPr>
-        <w:t>On submission, all three owners instantly receive a WhatsApp message:</w:t>
+        <w:t>On submission, both directors instantly receive a WhatsApp message:</w:t>
       </w:r>
     </w:p>
     <w:p>
@@ -1787,7 +1787,7 @@
           <w:color w:val="555566"/>
           <w:sz w:val="20"/>
         </w:rPr>
-        <w:t>Target keywords: "event production company Bengaluru", "LED wall rental Bengaluru", "concert stage setup company", and up to 8 total</w:t>
+        <w:t>Target keywords: "event production company Bengaluru", "LED wall rental Bengaluru", "event infrastructure setup Bengaluru", "concert stage setup company", and up to 8 total</w:t>
       </w:r>
     </w:p>
     <w:p>
@@ -2104,7 +2104,7 @@
           <w:color w:val="555566"/>
           <w:sz w:val="20"/>
         </w:rPr>
-        <w:t>Instant WhatsApp alert to all 3 owners on submission</w:t>
+        <w:t>Instant WhatsApp alert to both directors on submission</w:t>
       </w:r>
     </w:p>
     <w:p>
@@ -3230,7 +3230,7 @@
                 <w:color w:val="1A1A2E"/>
                 <w:sz w:val="18"/>
               </w:rPr>
-              <w:t>Advance</w:t>
+              <w:t>Advance Received</w:t>
             </w:r>
           </w:p>
         </w:tc>
@@ -3252,7 +3252,7 @@
                 <w:color w:val="1A1A2E"/>
                 <w:sz w:val="18"/>
               </w:rPr>
-              <w:t>₹8,000</w:t>
+              <w:t>₹5,000</w:t>
             </w:r>
           </w:p>
         </w:tc>
@@ -3274,7 +3274,7 @@
                 <w:color w:val="1A1A2E"/>
                 <w:sz w:val="18"/>
               </w:rPr>
-              <w:t>On agreement confirmation, before work begins</w:t>
+              <w:t>Received on the agreement date; work commences on this date</w:t>
             </w:r>
           </w:p>
         </w:tc>
@@ -3320,7 +3320,7 @@
                 <w:color w:val="1A1A2E"/>
                 <w:sz w:val="18"/>
               </w:rPr>
-              <w:t>₹10,000</w:t>
+              <w:t>₹13,000</w:t>
             </w:r>
           </w:p>
         </w:tc>
@@ -3741,7 +3741,7 @@
                 <w:color w:val="1A1A2E"/>
                 <w:sz w:val="18"/>
               </w:rPr>
-              <w:t>₹8,000 advance → ₹10,000 on first draft → ₹10,000 on sign-off</w:t>
+              <w:t>₹5,000 advance (received) → ₹13,000 on first draft → ₹10,000 on sign-off</w:t>
             </w:r>
           </w:p>
         </w:tc>
@@ -5499,6 +5499,129 @@
     </w:p>
     <w:p>
       <w:pPr>
+        <w:spacing w:before="160" w:after="80"/>
+      </w:pPr>
+      <w:r>
+        <w:rPr>
+          <w:rFonts w:ascii="Calibri" w:hAnsi="Calibri"/>
+          <w:b/>
+          <w:i w:val="0"/>
+          <w:color w:val="1A1A2E"/>
+          <w:sz w:val="26"/>
+        </w:rPr>
+        <w:t>Signatures</w:t>
+      </w:r>
+    </w:p>
+    <w:p>
+      <w:pPr>
+        <w:spacing w:before="0" w:after="80"/>
+      </w:pPr>
+      <w:r>
+        <w:rPr>
+          <w:rFonts w:ascii="Calibri" w:hAnsi="Calibri"/>
+          <w:b w:val="0"/>
+          <w:i w:val="0"/>
+          <w:color w:val="555566"/>
+          <w:sz w:val="20"/>
+        </w:rPr>
+        <w:t>This agreement is executed in two (2) original copies, one for the Client and one for Core Tensor. By signing below, both parties confirm their understanding and acceptance of the scope, payment terms, and conditions outlined in this document.</w:t>
+      </w:r>
+    </w:p>
+    <w:p/>
+    <w:p>
+      <w:r>
+        <w:rPr>
+          <w:rFonts w:ascii="Calibri" w:hAnsi="Calibri"/>
+          <w:b/>
+          <w:i w:val="0"/>
+          <w:color w:val="1A1A2E"/>
+          <w:sz w:val="20"/>
+        </w:rPr>
+        <w:t>For AAA Events &amp; Production:</w:t>
+      </w:r>
+    </w:p>
+    <w:p/>
+    <w:p/>
+    <w:p>
+      <w:r>
+        <w:t>_________________________________________</w:t>
+        <w:br/>
+      </w:r>
+      <w:r>
+        <w:rPr>
+          <w:rFonts w:ascii="Calibri" w:hAnsi="Calibri"/>
+          <w:b/>
+          <w:i w:val="0"/>
+          <w:color w:val="1A1A2E"/>
+          <w:sz w:val="20"/>
+        </w:rPr>
+        <w:t>Authorized Signatory (Director)</w:t>
+        <w:br/>
+      </w:r>
+      <w:r>
+        <w:rPr>
+          <w:rFonts w:ascii="Calibri" w:hAnsi="Calibri"/>
+          <w:b w:val="0"/>
+          <w:i w:val="0"/>
+          <w:color w:val="1A1A2E"/>
+          <w:sz w:val="20"/>
+        </w:rPr>
+        <w:t>Date: _______________</w:t>
+      </w:r>
+    </w:p>
+    <w:p/>
+    <w:p>
+      <w:r>
+        <w:rPr>
+          <w:rFonts w:ascii="Calibri" w:hAnsi="Calibri"/>
+          <w:b/>
+          <w:i w:val="0"/>
+          <w:color w:val="1A1A2E"/>
+          <w:sz w:val="20"/>
+        </w:rPr>
+        <w:t>For Core Tensor:</w:t>
+      </w:r>
+    </w:p>
+    <w:p/>
+    <w:p/>
+    <w:p>
+      <w:r>
+        <w:t>_________________________________________</w:t>
+        <w:br/>
+      </w:r>
+      <w:r>
+        <w:rPr>
+          <w:rFonts w:ascii="Calibri" w:hAnsi="Calibri"/>
+          <w:b/>
+          <w:i w:val="0"/>
+          <w:color w:val="1A1A2E"/>
+          <w:sz w:val="20"/>
+        </w:rPr>
+        <w:t>Authorized Signatory</w:t>
+        <w:br/>
+      </w:r>
+      <w:r>
+        <w:rPr>
+          <w:rFonts w:ascii="Calibri" w:hAnsi="Calibri"/>
+          <w:b w:val="0"/>
+          <w:i w:val="0"/>
+          <w:color w:val="1A1A2E"/>
+          <w:sz w:val="20"/>
+        </w:rPr>
+        <w:t>Date: _______________</w:t>
+      </w:r>
+    </w:p>
+    <w:p/>
+    <w:p>
+      <w:pPr>
+        <w:spacing w:before="120" w:after="120"/>
+        <w:pBdr>
+          <w:bottom w:val="single" w:sz="6" w:space="1" w:color="C99A06"/>
+        </w:pBdr>
+      </w:pPr>
+    </w:p>
+    <w:p>
+      <w:pPr>
         <w:jc w:val="center"/>
       </w:pPr>
       <w:r>

</xml_diff>